<commit_message>
feat: add GlobalExceptionHandler e EmailJaCadastradoException
</commit_message>
<xml_diff>
--- a/explicação_projeto.docx
+++ b/explicação_projeto.docx
@@ -764,6 +764,8 @@
       </w:r>
     </w:p>
     <w:p/>
+    <w:p/>
+    <w:p/>
     <w:p>
       <w:pPr>
         <w:pStyle w:val="3"/>
@@ -773,25 +775,7 @@
         <w:suppressLineNumbers w:val="0"/>
       </w:pPr>
       <w:r>
-        <w:t xml:space="preserve">🗂️ Estrutura de Pastas do </w:t>
-      </w:r>
-      <w:r>
-        <w:rPr>
-          <w:rStyle w:val="8"/>
-        </w:rPr>
-        <w:t>ms-usuarios</w:t>
-      </w:r>
-    </w:p>
-    <w:p>
-      <w:pPr>
-        <w:pStyle w:val="4"/>
-        <w:keepNext w:val="0"/>
-        <w:keepLines w:val="0"/>
-        <w:widowControl/>
-        <w:suppressLineNumbers w:val="0"/>
-      </w:pPr>
-      <w:r>
-        <w:t>Conceito — Por que organização importa?</w:t>
+        <w:t>📋 CONTEXTO DO PROJETO — Controle Financeiro Pessoal</w:t>
       </w:r>
     </w:p>
     <w:p>
@@ -805,7 +789,143 @@
         <w:ind w:left="0" w:right="0"/>
       </w:pPr>
       <w:r>
-        <w:t>No Mercado Livre e em qualquer empresa grande, vários devs trabalham no mesmo projeto. Uma estrutura bem definida garante que qualquer pessoa consiga entender onde está cada coisa sem precisar perguntar.</w:t>
+        <w:rPr>
+          <w:rStyle w:val="7"/>
+        </w:rPr>
+        <w:t>Objetivo:</w:t>
+      </w:r>
+      <w:r>
+        <w:t xml:space="preserve"> Aplicacao de controle financeiro pessoal para portfolio — candidatura ao Mercado Livre.</w:t>
+      </w:r>
+    </w:p>
+    <w:p>
+      <w:pPr>
+        <w:pStyle w:val="9"/>
+        <w:keepNext w:val="0"/>
+        <w:keepLines w:val="0"/>
+        <w:widowControl/>
+        <w:suppressLineNumbers w:val="0"/>
+        <w:spacing w:before="0" w:beforeAutospacing="1" w:after="0" w:afterAutospacing="1"/>
+        <w:ind w:left="0" w:right="0"/>
+      </w:pPr>
+      <w:r>
+        <w:rPr>
+          <w:rStyle w:val="7"/>
+        </w:rPr>
+        <w:t>Stack:</w:t>
+      </w:r>
+      <w:r>
+        <w:t xml:space="preserve"> Java 17 + Spring Boot 3.5 | Angular 19 | PostgreSQL | Docker | JWT | Flyway | Swagger</w:t>
+      </w:r>
+    </w:p>
+    <w:p>
+      <w:pPr>
+        <w:pStyle w:val="9"/>
+        <w:keepNext w:val="0"/>
+        <w:keepLines w:val="0"/>
+        <w:widowControl/>
+        <w:suppressLineNumbers w:val="0"/>
+        <w:spacing w:before="0" w:beforeAutospacing="1" w:after="0" w:afterAutospacing="1"/>
+        <w:ind w:left="0" w:right="0"/>
+      </w:pPr>
+      <w:r>
+        <w:rPr>
+          <w:rStyle w:val="7"/>
+        </w:rPr>
+        <w:t>GitHub:</w:t>
+      </w:r>
+      <w:r>
+        <w:t xml:space="preserve"> Taciolb | Branch atual: </w:t>
+      </w:r>
+      <w:r>
+        <w:rPr>
+          <w:rStyle w:val="8"/>
+        </w:rPr>
+        <w:t>feature/ms-usuarios</w:t>
+      </w:r>
+    </w:p>
+    <w:p>
+      <w:pPr>
+        <w:pStyle w:val="9"/>
+        <w:keepNext w:val="0"/>
+        <w:keepLines w:val="0"/>
+        <w:widowControl/>
+        <w:suppressLineNumbers w:val="0"/>
+        <w:spacing w:before="0" w:beforeAutospacing="1" w:after="0" w:afterAutospacing="1"/>
+        <w:ind w:left="0" w:right="0"/>
+      </w:pPr>
+      <w:r>
+        <w:rPr>
+          <w:rStyle w:val="7"/>
+        </w:rPr>
+        <w:t>Package base:</w:t>
+      </w:r>
+      <w:r>
+        <w:t xml:space="preserve"> </w:t>
+      </w:r>
+      <w:r>
+        <w:rPr>
+          <w:rStyle w:val="8"/>
+        </w:rPr>
+        <w:t>br.com.controlefinanceiro.msusuarios</w:t>
+      </w:r>
+    </w:p>
+    <w:p>
+      <w:pPr>
+        <w:pStyle w:val="9"/>
+        <w:keepNext w:val="0"/>
+        <w:keepLines w:val="0"/>
+        <w:widowControl/>
+        <w:suppressLineNumbers w:val="0"/>
+        <w:spacing w:before="0" w:beforeAutospacing="1" w:after="0" w:afterAutospacing="1"/>
+        <w:ind w:left="0" w:right="0"/>
+      </w:pPr>
+      <w:r>
+        <w:rPr>
+          <w:rStyle w:val="7"/>
+        </w:rPr>
+        <w:t>Arquitetura:</w:t>
+      </w:r>
+    </w:p>
+    <w:p>
+      <w:pPr>
+        <w:pStyle w:val="10"/>
+        <w:keepNext w:val="0"/>
+        <w:keepLines w:val="0"/>
+        <w:widowControl/>
+        <w:suppressLineNumbers w:val="0"/>
+        <w:rPr>
+          <w:rFonts w:ascii="var(--font-mono)" w:hAnsi="var(--font-mono)" w:eastAsia="var(--font-mono)" w:cs="var(--font-mono)"/>
+          <w:color w:val="EAECF0"/>
+        </w:rPr>
+      </w:pPr>
+      <w:r>
+        <w:rPr>
+          <w:rStyle w:val="8"/>
+          <w:rFonts w:hint="default" w:ascii="var(--font-mono)" w:hAnsi="var(--font-mono)" w:eastAsia="var(--font-mono)" w:cs="var(--font-mono)"/>
+          <w:color w:val="EAECF0"/>
+        </w:rPr>
+        <w:t>Angular (4200) -&gt; API Gateway/8080 -&gt; BFF/8085                                   -&gt; ms-usuarios/8081     (db CF_usuarios)                                   -&gt; ms-centro-custo/8082 (db CF_centrocusto)                                   -&gt; ms-lancamentos/8083  (db CF_lancamentos)                                   -&gt; ms-fluxo-caixa/8084  (db CF_fluxocaixa)Resilience4j em: ms-fluxo-caixa</w:t>
+      </w:r>
+    </w:p>
+    <w:p>
+      <w:pPr>
+        <w:pStyle w:val="9"/>
+        <w:keepNext w:val="0"/>
+        <w:keepLines w:val="0"/>
+        <w:widowControl/>
+        <w:suppressLineNumbers w:val="0"/>
+        <w:spacing w:before="0" w:beforeAutospacing="1" w:after="0" w:afterAutospacing="1"/>
+        <w:ind w:left="0" w:right="0"/>
+      </w:pPr>
+      <w:r>
+        <w:rPr>
+          <w:rStyle w:val="7"/>
+        </w:rPr>
+        <w:t>Regras de trabalho:</w:t>
+      </w:r>
+      <w:r>
+        <w:t xml:space="preserve"> Conceito antes do código | Explicar cada parte | Uma etapa por vez</w:t>
       </w:r>
     </w:p>
     <w:p>
@@ -817,7 +937,7 @@
       </w:pPr>
       <w:r>
         <w:pict>
-          <v:rect id="_x0000_i1032" o:spt="1" style="height:1.5pt;width:432pt;" fillcolor="#A0A0A0" filled="t" stroked="f" coordsize="21600,21600" o:hr="t" o:hrstd="t" o:hralign="center">
+          <v:rect id="_x0000_i1042" o:spt="1" style="height:1.5pt;width:432pt;" fillcolor="#A0A0A0" filled="t" stroked="f" coordsize="21600,21600" o:hr="t" o:hrstd="t" o:hralign="center">
             <v:path/>
             <v:fill on="t" focussize="0,0"/>
             <v:stroke on="f"/>
@@ -831,18 +951,6 @@
     </w:p>
     <w:p>
       <w:pPr>
-        <w:pStyle w:val="4"/>
-        <w:keepNext w:val="0"/>
-        <w:keepLines w:val="0"/>
-        <w:widowControl/>
-        <w:suppressLineNumbers w:val="0"/>
-      </w:pPr>
-      <w:r>
-        <w:t>O padrão que vamos usar — Arquitetura em Camadas</w:t>
-      </w:r>
-    </w:p>
-    <w:p>
-      <w:pPr>
         <w:pStyle w:val="9"/>
         <w:keepNext w:val="0"/>
         <w:keepLines w:val="0"/>
@@ -850,28 +958,152 @@
         <w:suppressLineNumbers w:val="0"/>
         <w:spacing w:before="0" w:beforeAutospacing="1" w:after="0" w:afterAutospacing="1"/>
         <w:ind w:left="0" w:right="0"/>
-        <w:rPr>
-          <w:color w:val="auto"/>
-        </w:rPr>
-      </w:pPr>
-      <w:r>
-        <w:rPr>
-          <w:color w:val="auto"/>
-        </w:rPr>
-        <w:t xml:space="preserve">É o padrão mais usado com Spring Boot. Cada camada tem uma </w:t>
-      </w:r>
+      </w:pPr>
       <w:r>
         <w:rPr>
           <w:rStyle w:val="7"/>
-          <w:color w:val="auto"/>
-        </w:rPr>
-        <w:t>responsabilidade única</w:t>
-      </w:r>
-      <w:r>
-        <w:rPr>
-          <w:color w:val="auto"/>
-        </w:rPr>
-        <w:t>:</w:t>
+        </w:rPr>
+        <w:t>✅ O que foi feito:</w:t>
+      </w:r>
+    </w:p>
+    <w:p>
+      <w:pPr>
+        <w:keepNext w:val="0"/>
+        <w:keepLines w:val="0"/>
+        <w:widowControl/>
+        <w:numPr>
+          <w:ilvl w:val="0"/>
+          <w:numId w:val="5"/>
+        </w:numPr>
+        <w:suppressLineNumbers w:val="0"/>
+        <w:spacing w:before="0" w:beforeAutospacing="1" w:after="0" w:afterAutospacing="1"/>
+        <w:ind w:left="720" w:hanging="360"/>
+      </w:pPr>
+      <w:r>
+        <w:t>README criado e no GitHub</w:t>
+      </w:r>
+    </w:p>
+    <w:p>
+      <w:pPr>
+        <w:keepNext w:val="0"/>
+        <w:keepLines w:val="0"/>
+        <w:widowControl/>
+        <w:numPr>
+          <w:ilvl w:val="0"/>
+          <w:numId w:val="5"/>
+        </w:numPr>
+        <w:suppressLineNumbers w:val="0"/>
+        <w:spacing w:before="0" w:beforeAutospacing="1" w:after="0" w:afterAutospacing="1"/>
+        <w:ind w:left="720" w:hanging="360"/>
+      </w:pPr>
+      <w:r>
+        <w:t>application.yaml configurado (porta 8081, ddl-auto: validate, JWT 24h)</w:t>
+      </w:r>
+    </w:p>
+    <w:p>
+      <w:pPr>
+        <w:keepNext w:val="0"/>
+        <w:keepLines w:val="0"/>
+        <w:widowControl/>
+        <w:numPr>
+          <w:ilvl w:val="0"/>
+          <w:numId w:val="5"/>
+        </w:numPr>
+        <w:suppressLineNumbers w:val="0"/>
+        <w:spacing w:before="0" w:beforeAutospacing="1" w:after="0" w:afterAutospacing="1"/>
+        <w:ind w:left="720" w:hanging="360"/>
+      </w:pPr>
+      <w:r>
+        <w:t>Estrutura de pacotes criada (controller, dto, entity, exception, repository, security, service)</w:t>
+      </w:r>
+    </w:p>
+    <w:p>
+      <w:pPr>
+        <w:keepNext w:val="0"/>
+        <w:keepLines w:val="0"/>
+        <w:widowControl/>
+        <w:numPr>
+          <w:ilvl w:val="0"/>
+          <w:numId w:val="5"/>
+        </w:numPr>
+        <w:suppressLineNumbers w:val="0"/>
+        <w:spacing w:before="0" w:beforeAutospacing="1" w:after="0" w:afterAutospacing="1"/>
+        <w:ind w:left="720" w:hanging="360"/>
+      </w:pPr>
+      <w:r>
+        <w:t>pom.xml com todas as dependencias (Flyway, JWT jjwt 0.12.6, SpringDoc 2.8.9)</w:t>
+      </w:r>
+    </w:p>
+    <w:p>
+      <w:pPr>
+        <w:keepNext w:val="0"/>
+        <w:keepLines w:val="0"/>
+        <w:widowControl/>
+        <w:numPr>
+          <w:ilvl w:val="0"/>
+          <w:numId w:val="5"/>
+        </w:numPr>
+        <w:suppressLineNumbers w:val="0"/>
+        <w:spacing w:before="0" w:beforeAutospacing="1" w:after="0" w:afterAutospacing="1"/>
+        <w:ind w:left="720" w:hanging="360"/>
+      </w:pPr>
+      <w:r>
+        <w:t xml:space="preserve">Pasta </w:t>
+      </w:r>
+      <w:r>
+        <w:rPr>
+          <w:rStyle w:val="8"/>
+        </w:rPr>
+        <w:t>db/migration</w:t>
+      </w:r>
+      <w:r>
+        <w:t xml:space="preserve"> criada</w:t>
+      </w:r>
+    </w:p>
+    <w:p>
+      <w:pPr>
+        <w:keepNext w:val="0"/>
+        <w:keepLines w:val="0"/>
+        <w:widowControl/>
+        <w:numPr>
+          <w:ilvl w:val="0"/>
+          <w:numId w:val="5"/>
+        </w:numPr>
+        <w:suppressLineNumbers w:val="0"/>
+        <w:spacing w:before="0" w:beforeAutospacing="1" w:after="0" w:afterAutospacing="1"/>
+        <w:ind w:left="720" w:hanging="360"/>
+      </w:pPr>
+      <w:r>
+        <w:rPr>
+          <w:rStyle w:val="8"/>
+        </w:rPr>
+        <w:t>V1__create_table_usuarios.sql</w:t>
+      </w:r>
+      <w:r>
+        <w:t xml:space="preserve"> criado (UUID, soft delete, index no email)</w:t>
+      </w:r>
+    </w:p>
+    <w:p>
+      <w:pPr>
+        <w:keepNext w:val="0"/>
+        <w:keepLines w:val="0"/>
+        <w:widowControl/>
+        <w:numPr>
+          <w:ilvl w:val="0"/>
+          <w:numId w:val="5"/>
+        </w:numPr>
+        <w:suppressLineNumbers w:val="0"/>
+        <w:spacing w:before="0" w:beforeAutospacing="1" w:after="0" w:afterAutospacing="1"/>
+        <w:ind w:left="720" w:hanging="360"/>
+      </w:pPr>
+      <w:r>
+        <w:rPr>
+          <w:rStyle w:val="8"/>
+        </w:rPr>
+        <w:t>Usuario.java</w:t>
+      </w:r>
+      <w:r>
+        <w:t xml:space="preserve"> (Entity) criada com Lombok + JPA</w:t>
       </w:r>
     </w:p>
     <w:p>
@@ -883,903 +1115,67 @@
         <w:suppressLineNumbers w:val="0"/>
         <w:spacing w:before="0" w:beforeAutospacing="1" w:after="0" w:afterAutospacing="1"/>
         <w:ind w:left="0" w:right="0"/>
-        <w:rPr>
-          <w:color w:val="auto"/>
-        </w:rPr>
-      </w:pPr>
-      <w:r>
-        <w:drawing>
-          <wp:inline distT="0" distB="0" distL="114300" distR="114300">
-            <wp:extent cx="4617720" cy="1089660"/>
-            <wp:effectExtent l="0" t="0" r="0" b="7620"/>
-            <wp:docPr id="2" name="Imagem 12"/>
-            <wp:cNvGraphicFramePr>
-              <a:graphicFrameLocks xmlns:a="http://schemas.openxmlformats.org/drawingml/2006/main" noChangeAspect="1"/>
-            </wp:cNvGraphicFramePr>
-            <a:graphic xmlns:a="http://schemas.openxmlformats.org/drawingml/2006/main">
-              <a:graphicData uri="http://schemas.openxmlformats.org/drawingml/2006/picture">
-                <pic:pic xmlns:pic="http://schemas.openxmlformats.org/drawingml/2006/picture">
-                  <pic:nvPicPr>
-                    <pic:cNvPr id="2" name="Imagem 12"/>
-                    <pic:cNvPicPr>
-                      <a:picLocks noChangeAspect="1"/>
-                    </pic:cNvPicPr>
-                  </pic:nvPicPr>
-                  <pic:blipFill>
-                    <a:blip r:embed="rId4"/>
-                    <a:stretch>
-                      <a:fillRect/>
-                    </a:stretch>
-                  </pic:blipFill>
-                  <pic:spPr>
-                    <a:xfrm>
-                      <a:off x="0" y="0"/>
-                      <a:ext cx="4617720" cy="1089660"/>
-                    </a:xfrm>
-                    <a:prstGeom prst="rect">
-                      <a:avLst/>
-                    </a:prstGeom>
-                    <a:noFill/>
-                    <a:ln>
-                      <a:noFill/>
-                    </a:ln>
-                  </pic:spPr>
-                </pic:pic>
-              </a:graphicData>
-            </a:graphic>
-          </wp:inline>
-        </w:drawing>
+      </w:pPr>
+      <w:r>
+        <w:rPr>
+          <w:rStyle w:val="7"/>
+        </w:rPr>
+        <w:t>⏳ Proximo passo:</w:t>
+      </w:r>
+      <w:r>
+        <w:t xml:space="preserve"> Criar os DTOs (</w:t>
+      </w:r>
+      <w:r>
+        <w:rPr>
+          <w:rStyle w:val="8"/>
+        </w:rPr>
+        <w:t>UsuarioRequestDTO</w:t>
+      </w:r>
+      <w:r>
+        <w:t xml:space="preserve"> e </w:t>
+      </w:r>
+      <w:r>
+        <w:rPr>
+          <w:rStyle w:val="8"/>
+        </w:rPr>
+        <w:t>UsuarioResponseDTO</w:t>
+      </w:r>
+      <w:r>
+        <w:t>)</w:t>
+      </w:r>
+    </w:p>
+    <w:p>
+      <w:pPr>
+        <w:rPr>
+          <w:rFonts w:hint="default"/>
+          <w:lang w:val="pt-BR"/>
+        </w:rPr>
+      </w:pPr>
+      <w:r>
+        <w:rPr>
+          <w:rFonts w:hint="default"/>
+          <w:lang w:val="pt-BR"/>
+        </w:rPr>
+        <w:t>Fazer uma explicação detalhada de cada passo que damos.</w:t>
       </w:r>
       <w:bookmarkStart w:id="0" w:name="_GoBack"/>
       <w:bookmarkEnd w:id="0"/>
     </w:p>
     <w:p>
       <w:pPr>
-        <w:pStyle w:val="4"/>
-        <w:keepNext w:val="0"/>
-        <w:keepLines w:val="0"/>
-        <w:widowControl/>
-        <w:suppressLineNumbers w:val="0"/>
-        <w:rPr>
-          <w:color w:val="auto"/>
-        </w:rPr>
-      </w:pPr>
-      <w:r>
-        <w:rPr>
-          <w:color w:val="auto"/>
-        </w:rPr>
-        <w:t>Por que DTO?</w:t>
-      </w:r>
-    </w:p>
-    <w:p>
-      <w:pPr>
-        <w:pStyle w:val="9"/>
-        <w:keepNext w:val="0"/>
-        <w:keepLines w:val="0"/>
-        <w:widowControl/>
-        <w:suppressLineNumbers w:val="0"/>
-        <w:spacing w:before="0" w:beforeAutospacing="1" w:after="0" w:afterAutospacing="1"/>
-        <w:ind w:left="0" w:right="0"/>
-      </w:pPr>
-      <w:r>
-        <w:t xml:space="preserve">Ótima prática que o Mercado Livre valoriza. Imagine que sua tabela </w:t>
-      </w:r>
-      <w:r>
-        <w:rPr>
-          <w:rStyle w:val="8"/>
-        </w:rPr>
-        <w:t>usuarios</w:t>
-      </w:r>
-      <w:r>
-        <w:t xml:space="preserve"> tem o campo </w:t>
-      </w:r>
-      <w:r>
-        <w:rPr>
-          <w:rStyle w:val="8"/>
-        </w:rPr>
-        <w:t>senha</w:t>
-      </w:r>
-      <w:r>
-        <w:t xml:space="preserve">. Você </w:t>
-      </w:r>
-      <w:r>
-        <w:rPr>
-          <w:rStyle w:val="7"/>
-        </w:rPr>
-        <w:t>nunca</w:t>
-      </w:r>
-      <w:r>
-        <w:t xml:space="preserve"> quer devolver a senha numa resposta HTTP. O DTO é um objeto separado que define </w:t>
-      </w:r>
-      <w:r>
-        <w:rPr>
-          <w:rStyle w:val="7"/>
-        </w:rPr>
-        <w:t>exatamente</w:t>
-      </w:r>
-      <w:r>
-        <w:t xml:space="preserve"> o que entra e o que sai da API.</w:t>
-      </w:r>
-    </w:p>
-    <w:p>
-      <w:pPr>
-        <w:pStyle w:val="10"/>
-        <w:keepNext w:val="0"/>
-        <w:keepLines w:val="0"/>
-        <w:widowControl/>
-        <w:suppressLineNumbers w:val="0"/>
-        <w:rPr>
-          <w:rFonts w:hint="default" w:ascii="var(--font-mono)" w:hAnsi="var(--font-mono)" w:eastAsia="var(--font-mono)" w:cs="var(--font-mono)"/>
-          <w:color w:val="EAECF0"/>
-        </w:rPr>
-      </w:pPr>
-      <w:r>
-        <w:rPr>
-          <w:rStyle w:val="8"/>
-          <w:rFonts w:hint="default" w:ascii="var(--font-mono)" w:hAnsi="var(--font-mono)" w:eastAsia="var(--font-mono)" w:cs="var(--font-mono)"/>
-          <w:color w:val="EAECF0"/>
-        </w:rPr>
-        <w:t>Requisição HTTP  →  DTO de entrada  →  Entity  →  BancoBanco  →  Entity  →  DTO de saída  →  Resposta HTTP</w:t>
-      </w:r>
-    </w:p>
-    <w:p>
-      <w:pPr>
-        <w:keepNext w:val="0"/>
-        <w:keepLines w:val="0"/>
-        <w:widowControl/>
-        <w:suppressLineNumbers w:val="0"/>
-      </w:pPr>
-      <w:r>
-        <w:rPr>
-          <w:rFonts w:hint="default" w:ascii="var(--font-mono)" w:hAnsi="var(--font-mono)" w:eastAsia="var(--font-mono)" w:cs="var(--font-mono)"/>
-          <w:color w:val="EAECF0"/>
-        </w:rPr>
-        <w:pict>
-          <v:rect id="_x0000_i1033" o:spt="1" style="height:1.5pt;width:432pt;" fillcolor="#A0A0A0" filled="t" stroked="f" coordsize="21600,21600" o:hr="t" o:hrstd="t" o:hralign="center">
-            <v:path/>
-            <v:fill on="t" focussize="0,0"/>
-            <v:stroke on="f"/>
-            <v:imagedata o:title=""/>
-            <o:lock v:ext="edit"/>
-            <w10:wrap type="none"/>
-            <w10:anchorlock/>
-          </v:rect>
-        </w:pict>
-      </w:r>
-    </w:p>
-    <w:p>
-      <w:pPr>
-        <w:pStyle w:val="4"/>
-        <w:keepNext w:val="0"/>
-        <w:keepLines w:val="0"/>
-        <w:widowControl/>
-        <w:suppressLineNumbers w:val="0"/>
-      </w:pPr>
-      <w:r>
-        <w:t>Estrutura completa</w:t>
-      </w:r>
-    </w:p>
-    <w:p/>
-    <w:p>
-      <w:r>
-        <w:drawing>
-          <wp:inline distT="0" distB="0" distL="114300" distR="114300">
-            <wp:extent cx="4991100" cy="6042660"/>
-            <wp:effectExtent l="0" t="0" r="7620" b="7620"/>
-            <wp:docPr id="1" name="Imagem 11"/>
-            <wp:cNvGraphicFramePr>
-              <a:graphicFrameLocks xmlns:a="http://schemas.openxmlformats.org/drawingml/2006/main" noChangeAspect="1"/>
-            </wp:cNvGraphicFramePr>
-            <a:graphic xmlns:a="http://schemas.openxmlformats.org/drawingml/2006/main">
-              <a:graphicData uri="http://schemas.openxmlformats.org/drawingml/2006/picture">
-                <pic:pic xmlns:pic="http://schemas.openxmlformats.org/drawingml/2006/picture">
-                  <pic:nvPicPr>
-                    <pic:cNvPr id="1" name="Imagem 11"/>
-                    <pic:cNvPicPr>
-                      <a:picLocks noChangeAspect="1"/>
-                    </pic:cNvPicPr>
-                  </pic:nvPicPr>
-                  <pic:blipFill>
-                    <a:blip r:embed="rId5"/>
-                    <a:stretch>
-                      <a:fillRect/>
-                    </a:stretch>
-                  </pic:blipFill>
-                  <pic:spPr>
-                    <a:xfrm>
-                      <a:off x="0" y="0"/>
-                      <a:ext cx="4991100" cy="6042660"/>
-                    </a:xfrm>
-                    <a:prstGeom prst="rect">
-                      <a:avLst/>
-                    </a:prstGeom>
-                    <a:noFill/>
-                    <a:ln>
-                      <a:noFill/>
-                    </a:ln>
-                  </pic:spPr>
-                </pic:pic>
-              </a:graphicData>
-            </a:graphic>
-          </wp:inline>
-        </w:drawing>
-      </w:r>
-    </w:p>
-    <w:p>
-      <w:pPr>
-        <w:keepNext w:val="0"/>
-        <w:keepLines w:val="0"/>
-        <w:widowControl/>
-        <w:suppressLineNumbers w:val="0"/>
-      </w:pPr>
-      <w:r>
-        <w:rPr>
-          <w:rFonts w:hint="default" w:ascii="var(--font-mono)" w:hAnsi="var(--font-mono)" w:eastAsia="var(--font-mono)" w:cs="var(--font-mono)"/>
-          <w:color w:val="EAECF0"/>
-        </w:rPr>
-        <w:pict>
-          <v:rect id="_x0000_i1034" o:spt="1" style="height:1.5pt;width:432pt;" fillcolor="#A0A0A0" filled="t" stroked="f" coordsize="21600,21600" o:hr="t" o:hrstd="t" o:hralign="center">
-            <v:path/>
-            <v:fill on="t" focussize="0,0"/>
-            <v:stroke on="f"/>
-            <v:imagedata o:title=""/>
-            <o:lock v:ext="edit"/>
-            <w10:wrap type="none"/>
-            <w10:anchorlock/>
-          </v:rect>
-        </w:pict>
-      </w:r>
-    </w:p>
-    <w:p>
-      <w:pPr>
-        <w:pStyle w:val="4"/>
-        <w:keepNext w:val="0"/>
-        <w:keepLines w:val="0"/>
-        <w:widowControl/>
-        <w:suppressLineNumbers w:val="0"/>
-      </w:pPr>
-      <w:r>
-        <w:t>O que cada pacote faz:</w:t>
-      </w:r>
-    </w:p>
-    <w:tbl>
-      <w:tblPr>
-        <w:tblW w:w="0" w:type="auto"/>
-        <w:tblCellSpacing w:w="15" w:type="dxa"/>
-        <w:tblInd w:w="0" w:type="dxa"/>
-        <w:tblBorders>
-          <w:top w:val="none" w:color="auto" w:sz="0" w:space="0"/>
-          <w:left w:val="none" w:color="auto" w:sz="0" w:space="0"/>
-          <w:bottom w:val="none" w:color="auto" w:sz="0" w:space="0"/>
-          <w:right w:val="none" w:color="auto" w:sz="0" w:space="0"/>
-          <w:insideH w:val="none" w:color="auto" w:sz="0" w:space="0"/>
-          <w:insideV w:val="none" w:color="auto" w:sz="0" w:space="0"/>
-        </w:tblBorders>
-        <w:shd w:val="clear"/>
-        <w:tblLayout w:type="autofit"/>
-        <w:tblCellMar>
-          <w:top w:w="15" w:type="dxa"/>
-          <w:left w:w="15" w:type="dxa"/>
-          <w:bottom w:w="15" w:type="dxa"/>
-          <w:right w:w="15" w:type="dxa"/>
-        </w:tblCellMar>
-      </w:tblPr>
-      <w:tblGrid>
-        <w:gridCol w:w="1275"/>
-        <w:gridCol w:w="4875"/>
-      </w:tblGrid>
-      <w:tr>
-        <w:tblPrEx>
-          <w:tblBorders>
-            <w:top w:val="none" w:color="auto" w:sz="0" w:space="0"/>
-            <w:left w:val="none" w:color="auto" w:sz="0" w:space="0"/>
-            <w:bottom w:val="none" w:color="auto" w:sz="0" w:space="0"/>
-            <w:right w:val="none" w:color="auto" w:sz="0" w:space="0"/>
-            <w:insideH w:val="none" w:color="auto" w:sz="0" w:space="0"/>
-            <w:insideV w:val="none" w:color="auto" w:sz="0" w:space="0"/>
-          </w:tblBorders>
-          <w:tblCellMar>
-            <w:top w:w="15" w:type="dxa"/>
-            <w:left w:w="15" w:type="dxa"/>
-            <w:bottom w:w="15" w:type="dxa"/>
-            <w:right w:w="15" w:type="dxa"/>
-          </w:tblCellMar>
-        </w:tblPrEx>
-        <w:trPr>
-          <w:tblCellSpacing w:w="15" w:type="dxa"/>
-        </w:trPr>
-        <w:tc>
-          <w:tcPr>
-            <w:tcW w:w="0" w:type="auto"/>
-            <w:shd w:val="clear"/>
-            <w:vAlign w:val="center"/>
-          </w:tcPr>
-          <w:p>
-            <w:pPr>
-              <w:keepNext w:val="0"/>
-              <w:keepLines w:val="0"/>
-              <w:widowControl/>
-              <w:suppressLineNumbers w:val="0"/>
-              <w:jc w:val="center"/>
-              <w:rPr>
-                <w:b/>
-                <w:bCs/>
-              </w:rPr>
-            </w:pPr>
-            <w:r>
-              <w:rPr>
-                <w:rFonts w:ascii="SimSun" w:hAnsi="SimSun" w:eastAsia="SimSun" w:cs="SimSun"/>
-                <w:b/>
-                <w:bCs/>
-                <w:kern w:val="0"/>
-                <w:sz w:val="24"/>
-                <w:szCs w:val="24"/>
-                <w:lang w:val="en-US" w:eastAsia="zh-CN" w:bidi="ar"/>
-              </w:rPr>
-              <w:t>Pacote</w:t>
-            </w:r>
-          </w:p>
-        </w:tc>
-        <w:tc>
-          <w:tcPr>
-            <w:tcW w:w="0" w:type="auto"/>
-            <w:shd w:val="clear"/>
-            <w:vAlign w:val="center"/>
-          </w:tcPr>
-          <w:p>
-            <w:pPr>
-              <w:keepNext w:val="0"/>
-              <w:keepLines w:val="0"/>
-              <w:widowControl/>
-              <w:suppressLineNumbers w:val="0"/>
-              <w:jc w:val="center"/>
-              <w:rPr>
-                <w:b/>
-                <w:bCs/>
-              </w:rPr>
-            </w:pPr>
-            <w:r>
-              <w:rPr>
-                <w:rFonts w:ascii="SimSun" w:hAnsi="SimSun" w:eastAsia="SimSun" w:cs="SimSun"/>
-                <w:b/>
-                <w:bCs/>
-                <w:kern w:val="0"/>
-                <w:sz w:val="24"/>
-                <w:szCs w:val="24"/>
-                <w:lang w:val="en-US" w:eastAsia="zh-CN" w:bidi="ar"/>
-              </w:rPr>
-              <w:t>Responsabilidade</w:t>
-            </w:r>
-          </w:p>
-        </w:tc>
-      </w:tr>
-      <w:tr>
-        <w:tblPrEx>
-          <w:tblBorders>
-            <w:top w:val="none" w:color="auto" w:sz="0" w:space="0"/>
-            <w:left w:val="none" w:color="auto" w:sz="0" w:space="0"/>
-            <w:bottom w:val="none" w:color="auto" w:sz="0" w:space="0"/>
-            <w:right w:val="none" w:color="auto" w:sz="0" w:space="0"/>
-            <w:insideH w:val="none" w:color="auto" w:sz="0" w:space="0"/>
-            <w:insideV w:val="none" w:color="auto" w:sz="0" w:space="0"/>
-          </w:tblBorders>
-          <w:shd w:val="clear"/>
-          <w:tblCellMar>
-            <w:top w:w="15" w:type="dxa"/>
-            <w:left w:w="15" w:type="dxa"/>
-            <w:bottom w:w="15" w:type="dxa"/>
-            <w:right w:w="15" w:type="dxa"/>
-          </w:tblCellMar>
-        </w:tblPrEx>
-        <w:trPr>
-          <w:tblCellSpacing w:w="15" w:type="dxa"/>
-        </w:trPr>
-        <w:tc>
-          <w:tcPr>
-            <w:tcW w:w="0" w:type="auto"/>
-            <w:shd w:val="clear"/>
-            <w:vAlign w:val="center"/>
-          </w:tcPr>
-          <w:p>
-            <w:pPr>
-              <w:keepNext w:val="0"/>
-              <w:keepLines w:val="0"/>
-              <w:widowControl/>
-              <w:suppressLineNumbers w:val="0"/>
-              <w:jc w:val="left"/>
-            </w:pPr>
-            <w:r>
-              <w:rPr>
-                <w:rStyle w:val="8"/>
-                <w:rFonts w:ascii="SimSun" w:hAnsi="SimSun" w:eastAsia="SimSun" w:cs="SimSun"/>
-                <w:kern w:val="0"/>
-                <w:sz w:val="24"/>
-                <w:szCs w:val="24"/>
-                <w:lang w:val="en-US" w:eastAsia="zh-CN" w:bidi="ar"/>
-              </w:rPr>
-              <w:t>controller</w:t>
-            </w:r>
-          </w:p>
-        </w:tc>
-        <w:tc>
-          <w:tcPr>
-            <w:tcW w:w="0" w:type="auto"/>
-            <w:shd w:val="clear"/>
-            <w:vAlign w:val="center"/>
-          </w:tcPr>
-          <w:p>
-            <w:pPr>
-              <w:keepNext w:val="0"/>
-              <w:keepLines w:val="0"/>
-              <w:widowControl/>
-              <w:suppressLineNumbers w:val="0"/>
-              <w:jc w:val="left"/>
-            </w:pPr>
-            <w:r>
-              <w:rPr>
-                <w:rFonts w:ascii="SimSun" w:hAnsi="SimSun" w:eastAsia="SimSun" w:cs="SimSun"/>
-                <w:kern w:val="0"/>
-                <w:sz w:val="24"/>
-                <w:szCs w:val="24"/>
-                <w:lang w:val="en-US" w:eastAsia="zh-CN" w:bidi="ar"/>
-              </w:rPr>
-              <w:t>Recebe requisições HTTP, chama o Service</w:t>
-            </w:r>
-          </w:p>
-        </w:tc>
-      </w:tr>
-      <w:tr>
-        <w:tblPrEx>
-          <w:tblBorders>
-            <w:top w:val="none" w:color="auto" w:sz="0" w:space="0"/>
-            <w:left w:val="none" w:color="auto" w:sz="0" w:space="0"/>
-            <w:bottom w:val="none" w:color="auto" w:sz="0" w:space="0"/>
-            <w:right w:val="none" w:color="auto" w:sz="0" w:space="0"/>
-            <w:insideH w:val="none" w:color="auto" w:sz="0" w:space="0"/>
-            <w:insideV w:val="none" w:color="auto" w:sz="0" w:space="0"/>
-          </w:tblBorders>
-          <w:shd w:val="clear"/>
-          <w:tblCellMar>
-            <w:top w:w="15" w:type="dxa"/>
-            <w:left w:w="15" w:type="dxa"/>
-            <w:bottom w:w="15" w:type="dxa"/>
-            <w:right w:w="15" w:type="dxa"/>
-          </w:tblCellMar>
-        </w:tblPrEx>
-        <w:trPr>
-          <w:tblCellSpacing w:w="15" w:type="dxa"/>
-        </w:trPr>
-        <w:tc>
-          <w:tcPr>
-            <w:tcW w:w="0" w:type="auto"/>
-            <w:shd w:val="clear"/>
-            <w:vAlign w:val="center"/>
-          </w:tcPr>
-          <w:p>
-            <w:pPr>
-              <w:keepNext w:val="0"/>
-              <w:keepLines w:val="0"/>
-              <w:widowControl/>
-              <w:suppressLineNumbers w:val="0"/>
-              <w:jc w:val="left"/>
-            </w:pPr>
-            <w:r>
-              <w:rPr>
-                <w:rStyle w:val="8"/>
-                <w:rFonts w:ascii="SimSun" w:hAnsi="SimSun" w:eastAsia="SimSun" w:cs="SimSun"/>
-                <w:kern w:val="0"/>
-                <w:sz w:val="24"/>
-                <w:szCs w:val="24"/>
-                <w:lang w:val="en-US" w:eastAsia="zh-CN" w:bidi="ar"/>
-              </w:rPr>
-              <w:t>service</w:t>
-            </w:r>
-          </w:p>
-        </w:tc>
-        <w:tc>
-          <w:tcPr>
-            <w:tcW w:w="0" w:type="auto"/>
-            <w:shd w:val="clear"/>
-            <w:vAlign w:val="center"/>
-          </w:tcPr>
-          <w:p>
-            <w:pPr>
-              <w:keepNext w:val="0"/>
-              <w:keepLines w:val="0"/>
-              <w:widowControl/>
-              <w:suppressLineNumbers w:val="0"/>
-              <w:jc w:val="left"/>
-            </w:pPr>
-            <w:r>
-              <w:rPr>
-                <w:rFonts w:ascii="SimSun" w:hAnsi="SimSun" w:eastAsia="SimSun" w:cs="SimSun"/>
-                <w:kern w:val="0"/>
-                <w:sz w:val="24"/>
-                <w:szCs w:val="24"/>
-                <w:lang w:val="en-US" w:eastAsia="zh-CN" w:bidi="ar"/>
-              </w:rPr>
-              <w:t>Regras de negócio, chama o Repository</w:t>
-            </w:r>
-          </w:p>
-        </w:tc>
-      </w:tr>
-      <w:tr>
-        <w:tblPrEx>
-          <w:tblBorders>
-            <w:top w:val="none" w:color="auto" w:sz="0" w:space="0"/>
-            <w:left w:val="none" w:color="auto" w:sz="0" w:space="0"/>
-            <w:bottom w:val="none" w:color="auto" w:sz="0" w:space="0"/>
-            <w:right w:val="none" w:color="auto" w:sz="0" w:space="0"/>
-            <w:insideH w:val="none" w:color="auto" w:sz="0" w:space="0"/>
-            <w:insideV w:val="none" w:color="auto" w:sz="0" w:space="0"/>
-          </w:tblBorders>
-          <w:shd w:val="clear"/>
-          <w:tblCellMar>
-            <w:top w:w="15" w:type="dxa"/>
-            <w:left w:w="15" w:type="dxa"/>
-            <w:bottom w:w="15" w:type="dxa"/>
-            <w:right w:w="15" w:type="dxa"/>
-          </w:tblCellMar>
-        </w:tblPrEx>
-        <w:trPr>
-          <w:tblCellSpacing w:w="15" w:type="dxa"/>
-        </w:trPr>
-        <w:tc>
-          <w:tcPr>
-            <w:tcW w:w="0" w:type="auto"/>
-            <w:shd w:val="clear"/>
-            <w:vAlign w:val="center"/>
-          </w:tcPr>
-          <w:p>
-            <w:pPr>
-              <w:keepNext w:val="0"/>
-              <w:keepLines w:val="0"/>
-              <w:widowControl/>
-              <w:suppressLineNumbers w:val="0"/>
-              <w:jc w:val="left"/>
-            </w:pPr>
-            <w:r>
-              <w:rPr>
-                <w:rStyle w:val="8"/>
-                <w:rFonts w:ascii="SimSun" w:hAnsi="SimSun" w:eastAsia="SimSun" w:cs="SimSun"/>
-                <w:kern w:val="0"/>
-                <w:sz w:val="24"/>
-                <w:szCs w:val="24"/>
-                <w:lang w:val="en-US" w:eastAsia="zh-CN" w:bidi="ar"/>
-              </w:rPr>
-              <w:t>repository</w:t>
-            </w:r>
-          </w:p>
-        </w:tc>
-        <w:tc>
-          <w:tcPr>
-            <w:tcW w:w="0" w:type="auto"/>
-            <w:shd w:val="clear"/>
-            <w:vAlign w:val="center"/>
-          </w:tcPr>
-          <w:p>
-            <w:pPr>
-              <w:keepNext w:val="0"/>
-              <w:keepLines w:val="0"/>
-              <w:widowControl/>
-              <w:suppressLineNumbers w:val="0"/>
-              <w:jc w:val="left"/>
-            </w:pPr>
-            <w:r>
-              <w:rPr>
-                <w:rFonts w:ascii="SimSun" w:hAnsi="SimSun" w:eastAsia="SimSun" w:cs="SimSun"/>
-                <w:kern w:val="0"/>
-                <w:sz w:val="24"/>
-                <w:szCs w:val="24"/>
-                <w:lang w:val="en-US" w:eastAsia="zh-CN" w:bidi="ar"/>
-              </w:rPr>
-              <w:t>Interface com o banco via JPA</w:t>
-            </w:r>
-          </w:p>
-        </w:tc>
-      </w:tr>
-      <w:tr>
-        <w:tblPrEx>
-          <w:tblBorders>
-            <w:top w:val="none" w:color="auto" w:sz="0" w:space="0"/>
-            <w:left w:val="none" w:color="auto" w:sz="0" w:space="0"/>
-            <w:bottom w:val="none" w:color="auto" w:sz="0" w:space="0"/>
-            <w:right w:val="none" w:color="auto" w:sz="0" w:space="0"/>
-            <w:insideH w:val="none" w:color="auto" w:sz="0" w:space="0"/>
-            <w:insideV w:val="none" w:color="auto" w:sz="0" w:space="0"/>
-          </w:tblBorders>
-          <w:shd w:val="clear"/>
-          <w:tblCellMar>
-            <w:top w:w="15" w:type="dxa"/>
-            <w:left w:w="15" w:type="dxa"/>
-            <w:bottom w:w="15" w:type="dxa"/>
-            <w:right w:w="15" w:type="dxa"/>
-          </w:tblCellMar>
-        </w:tblPrEx>
-        <w:trPr>
-          <w:tblCellSpacing w:w="15" w:type="dxa"/>
-        </w:trPr>
-        <w:tc>
-          <w:tcPr>
-            <w:tcW w:w="0" w:type="auto"/>
-            <w:shd w:val="clear"/>
-            <w:vAlign w:val="center"/>
-          </w:tcPr>
-          <w:p>
-            <w:pPr>
-              <w:keepNext w:val="0"/>
-              <w:keepLines w:val="0"/>
-              <w:widowControl/>
-              <w:suppressLineNumbers w:val="0"/>
-              <w:jc w:val="left"/>
-            </w:pPr>
-            <w:r>
-              <w:rPr>
-                <w:rStyle w:val="8"/>
-                <w:rFonts w:ascii="SimSun" w:hAnsi="SimSun" w:eastAsia="SimSun" w:cs="SimSun"/>
-                <w:kern w:val="0"/>
-                <w:sz w:val="24"/>
-                <w:szCs w:val="24"/>
-                <w:lang w:val="en-US" w:eastAsia="zh-CN" w:bidi="ar"/>
-              </w:rPr>
-              <w:t>entity</w:t>
-            </w:r>
-          </w:p>
-        </w:tc>
-        <w:tc>
-          <w:tcPr>
-            <w:tcW w:w="0" w:type="auto"/>
-            <w:shd w:val="clear"/>
-            <w:vAlign w:val="center"/>
-          </w:tcPr>
-          <w:p>
-            <w:pPr>
-              <w:keepNext w:val="0"/>
-              <w:keepLines w:val="0"/>
-              <w:widowControl/>
-              <w:suppressLineNumbers w:val="0"/>
-              <w:jc w:val="left"/>
-            </w:pPr>
-            <w:r>
-              <w:rPr>
-                <w:rFonts w:ascii="SimSun" w:hAnsi="SimSun" w:eastAsia="SimSun" w:cs="SimSun"/>
-                <w:kern w:val="0"/>
-                <w:sz w:val="24"/>
-                <w:szCs w:val="24"/>
-                <w:lang w:val="en-US" w:eastAsia="zh-CN" w:bidi="ar"/>
-              </w:rPr>
-              <w:t>Representa a tabela do banco</w:t>
-            </w:r>
-          </w:p>
-        </w:tc>
-      </w:tr>
-      <w:tr>
-        <w:tblPrEx>
-          <w:tblBorders>
-            <w:top w:val="none" w:color="auto" w:sz="0" w:space="0"/>
-            <w:left w:val="none" w:color="auto" w:sz="0" w:space="0"/>
-            <w:bottom w:val="none" w:color="auto" w:sz="0" w:space="0"/>
-            <w:right w:val="none" w:color="auto" w:sz="0" w:space="0"/>
-            <w:insideH w:val="none" w:color="auto" w:sz="0" w:space="0"/>
-            <w:insideV w:val="none" w:color="auto" w:sz="0" w:space="0"/>
-          </w:tblBorders>
-          <w:shd w:val="clear"/>
-          <w:tblCellMar>
-            <w:top w:w="15" w:type="dxa"/>
-            <w:left w:w="15" w:type="dxa"/>
-            <w:bottom w:w="15" w:type="dxa"/>
-            <w:right w:w="15" w:type="dxa"/>
-          </w:tblCellMar>
-        </w:tblPrEx>
-        <w:trPr>
-          <w:tblCellSpacing w:w="15" w:type="dxa"/>
-        </w:trPr>
-        <w:tc>
-          <w:tcPr>
-            <w:tcW w:w="0" w:type="auto"/>
-            <w:shd w:val="clear"/>
-            <w:vAlign w:val="center"/>
-          </w:tcPr>
-          <w:p>
-            <w:pPr>
-              <w:keepNext w:val="0"/>
-              <w:keepLines w:val="0"/>
-              <w:widowControl/>
-              <w:suppressLineNumbers w:val="0"/>
-              <w:jc w:val="left"/>
-            </w:pPr>
-            <w:r>
-              <w:rPr>
-                <w:rStyle w:val="8"/>
-                <w:rFonts w:ascii="SimSun" w:hAnsi="SimSun" w:eastAsia="SimSun" w:cs="SimSun"/>
-                <w:kern w:val="0"/>
-                <w:sz w:val="24"/>
-                <w:szCs w:val="24"/>
-                <w:lang w:val="en-US" w:eastAsia="zh-CN" w:bidi="ar"/>
-              </w:rPr>
-              <w:t>dto</w:t>
-            </w:r>
-          </w:p>
-        </w:tc>
-        <w:tc>
-          <w:tcPr>
-            <w:tcW w:w="0" w:type="auto"/>
-            <w:shd w:val="clear"/>
-            <w:vAlign w:val="center"/>
-          </w:tcPr>
-          <w:p>
-            <w:pPr>
-              <w:keepNext w:val="0"/>
-              <w:keepLines w:val="0"/>
-              <w:widowControl/>
-              <w:suppressLineNumbers w:val="0"/>
-              <w:jc w:val="left"/>
-            </w:pPr>
-            <w:r>
-              <w:rPr>
-                <w:rFonts w:ascii="SimSun" w:hAnsi="SimSun" w:eastAsia="SimSun" w:cs="SimSun"/>
-                <w:kern w:val="0"/>
-                <w:sz w:val="24"/>
-                <w:szCs w:val="24"/>
-                <w:lang w:val="en-US" w:eastAsia="zh-CN" w:bidi="ar"/>
-              </w:rPr>
-              <w:t>Objetos de entrada e saída da API</w:t>
-            </w:r>
-          </w:p>
-        </w:tc>
-      </w:tr>
-      <w:tr>
-        <w:tblPrEx>
-          <w:tblBorders>
-            <w:top w:val="none" w:color="auto" w:sz="0" w:space="0"/>
-            <w:left w:val="none" w:color="auto" w:sz="0" w:space="0"/>
-            <w:bottom w:val="none" w:color="auto" w:sz="0" w:space="0"/>
-            <w:right w:val="none" w:color="auto" w:sz="0" w:space="0"/>
-            <w:insideH w:val="none" w:color="auto" w:sz="0" w:space="0"/>
-            <w:insideV w:val="none" w:color="auto" w:sz="0" w:space="0"/>
-          </w:tblBorders>
-          <w:shd w:val="clear"/>
-          <w:tblCellMar>
-            <w:top w:w="15" w:type="dxa"/>
-            <w:left w:w="15" w:type="dxa"/>
-            <w:bottom w:w="15" w:type="dxa"/>
-            <w:right w:w="15" w:type="dxa"/>
-          </w:tblCellMar>
-        </w:tblPrEx>
-        <w:trPr>
-          <w:tblCellSpacing w:w="15" w:type="dxa"/>
-        </w:trPr>
-        <w:tc>
-          <w:tcPr>
-            <w:tcW w:w="0" w:type="auto"/>
-            <w:shd w:val="clear"/>
-            <w:vAlign w:val="center"/>
-          </w:tcPr>
-          <w:p>
-            <w:pPr>
-              <w:keepNext w:val="0"/>
-              <w:keepLines w:val="0"/>
-              <w:widowControl/>
-              <w:suppressLineNumbers w:val="0"/>
-              <w:jc w:val="left"/>
-            </w:pPr>
-            <w:r>
-              <w:rPr>
-                <w:rStyle w:val="8"/>
-                <w:rFonts w:ascii="SimSun" w:hAnsi="SimSun" w:eastAsia="SimSun" w:cs="SimSun"/>
-                <w:kern w:val="0"/>
-                <w:sz w:val="24"/>
-                <w:szCs w:val="24"/>
-                <w:lang w:val="en-US" w:eastAsia="zh-CN" w:bidi="ar"/>
-              </w:rPr>
-              <w:t>security</w:t>
-            </w:r>
-          </w:p>
-        </w:tc>
-        <w:tc>
-          <w:tcPr>
-            <w:tcW w:w="0" w:type="auto"/>
-            <w:shd w:val="clear"/>
-            <w:vAlign w:val="center"/>
-          </w:tcPr>
-          <w:p>
-            <w:pPr>
-              <w:keepNext w:val="0"/>
-              <w:keepLines w:val="0"/>
-              <w:widowControl/>
-              <w:suppressLineNumbers w:val="0"/>
-              <w:jc w:val="left"/>
-            </w:pPr>
-            <w:r>
-              <w:rPr>
-                <w:rFonts w:ascii="SimSun" w:hAnsi="SimSun" w:eastAsia="SimSun" w:cs="SimSun"/>
-                <w:kern w:val="0"/>
-                <w:sz w:val="24"/>
-                <w:szCs w:val="24"/>
-                <w:lang w:val="en-US" w:eastAsia="zh-CN" w:bidi="ar"/>
-              </w:rPr>
-              <w:t>JWT, filtros e configuração de segurança</w:t>
-            </w:r>
-          </w:p>
-        </w:tc>
-      </w:tr>
-      <w:tr>
-        <w:tblPrEx>
-          <w:tblBorders>
-            <w:top w:val="none" w:color="auto" w:sz="0" w:space="0"/>
-            <w:left w:val="none" w:color="auto" w:sz="0" w:space="0"/>
-            <w:bottom w:val="none" w:color="auto" w:sz="0" w:space="0"/>
-            <w:right w:val="none" w:color="auto" w:sz="0" w:space="0"/>
-            <w:insideH w:val="none" w:color="auto" w:sz="0" w:space="0"/>
-            <w:insideV w:val="none" w:color="auto" w:sz="0" w:space="0"/>
-          </w:tblBorders>
-          <w:shd w:val="clear"/>
-          <w:tblCellMar>
-            <w:top w:w="15" w:type="dxa"/>
-            <w:left w:w="15" w:type="dxa"/>
-            <w:bottom w:w="15" w:type="dxa"/>
-            <w:right w:w="15" w:type="dxa"/>
-          </w:tblCellMar>
-        </w:tblPrEx>
-        <w:trPr>
-          <w:tblCellSpacing w:w="15" w:type="dxa"/>
-        </w:trPr>
-        <w:tc>
-          <w:tcPr>
-            <w:tcW w:w="0" w:type="auto"/>
-            <w:shd w:val="clear"/>
-            <w:vAlign w:val="center"/>
-          </w:tcPr>
-          <w:p>
-            <w:pPr>
-              <w:keepNext w:val="0"/>
-              <w:keepLines w:val="0"/>
-              <w:widowControl/>
-              <w:suppressLineNumbers w:val="0"/>
-              <w:jc w:val="left"/>
-            </w:pPr>
-            <w:r>
-              <w:rPr>
-                <w:rStyle w:val="8"/>
-                <w:rFonts w:ascii="SimSun" w:hAnsi="SimSun" w:eastAsia="SimSun" w:cs="SimSun"/>
-                <w:kern w:val="0"/>
-                <w:sz w:val="24"/>
-                <w:szCs w:val="24"/>
-                <w:lang w:val="en-US" w:eastAsia="zh-CN" w:bidi="ar"/>
-              </w:rPr>
-              <w:t>exception</w:t>
-            </w:r>
-          </w:p>
-        </w:tc>
-        <w:tc>
-          <w:tcPr>
-            <w:tcW w:w="0" w:type="auto"/>
-            <w:shd w:val="clear"/>
-            <w:vAlign w:val="center"/>
-          </w:tcPr>
-          <w:p>
-            <w:pPr>
-              <w:keepNext w:val="0"/>
-              <w:keepLines w:val="0"/>
-              <w:widowControl/>
-              <w:suppressLineNumbers w:val="0"/>
-              <w:jc w:val="left"/>
-            </w:pPr>
-            <w:r>
-              <w:rPr>
-                <w:rFonts w:ascii="SimSun" w:hAnsi="SimSun" w:eastAsia="SimSun" w:cs="SimSun"/>
-                <w:kern w:val="0"/>
-                <w:sz w:val="24"/>
-                <w:szCs w:val="24"/>
-                <w:lang w:val="en-US" w:eastAsia="zh-CN" w:bidi="ar"/>
-              </w:rPr>
-              <w:t>Tratamento global de erros</w:t>
-            </w:r>
-          </w:p>
-        </w:tc>
-      </w:tr>
-    </w:tbl>
-    <w:p/>
+        <w:rPr>
+          <w:rFonts w:hint="default"/>
+          <w:lang w:val="pt-BR"/>
+        </w:rPr>
+      </w:pPr>
+      <w:r>
+        <w:rPr>
+          <w:rFonts w:hint="default"/>
+          <w:lang w:val="pt-BR"/>
+        </w:rPr>
+        <w:t>Não esquecer de ir guardando para o final salvar todas as explicações em WORD</w:t>
+      </w:r>
+    </w:p>
     <w:sectPr>
       <w:pgSz w:w="11906" w:h="16838"/>
       <w:pgMar w:top="1440" w:right="1800" w:bottom="1440" w:left="1800" w:header="720" w:footer="720" w:gutter="0"/>
@@ -1793,6 +1189,155 @@
 <file path=word/numbering.xml><?xml version="1.0" encoding="utf-8"?>
 <w:numbering xmlns:wpc="http://schemas.microsoft.com/office/word/2010/wordprocessingCanvas" xmlns:mc="http://schemas.openxmlformats.org/markup-compatibility/2006" xmlns:o="urn:schemas-microsoft-com:office:office" xmlns:r="http://schemas.openxmlformats.org/officeDocument/2006/relationships" xmlns:m="http://schemas.openxmlformats.org/officeDocument/2006/math" xmlns:v="urn:schemas-microsoft-com:vml" xmlns:wp14="http://schemas.microsoft.com/office/word/2010/wordprocessingDrawing" xmlns:wp="http://schemas.openxmlformats.org/drawingml/2006/wordprocessingDrawing" xmlns:w10="urn:schemas-microsoft-com:office:word" xmlns:w="http://schemas.openxmlformats.org/wordprocessingml/2006/main" xmlns:w14="http://schemas.microsoft.com/office/word/2010/wordml" xmlns:wpg="http://schemas.microsoft.com/office/word/2010/wordprocessingGroup" xmlns:wpi="http://schemas.microsoft.com/office/word/2010/wordprocessingInk" xmlns:wne="http://schemas.microsoft.com/office/word/2006/wordml" xmlns:wps="http://schemas.microsoft.com/office/word/2010/wordprocessingShape" xmlns:wpsCustomData="http://www.wps.cn/officeDocument/2013/wpsCustomData" mc:Ignorable="w14 wp14">
   <w:abstractNum w:abstractNumId="0">
+    <w:nsid w:val="B11F39EF"/>
+    <w:multiLevelType w:val="multilevel"/>
+    <w:tmpl w:val="B11F39EF"/>
+    <w:lvl w:ilvl="0" w:tentative="0">
+      <w:start w:val="1"/>
+      <w:numFmt w:val="bullet"/>
+      <w:lvlText w:val=""/>
+      <w:lvlJc w:val="left"/>
+      <w:pPr>
+        <w:tabs>
+          <w:tab w:val="left" w:pos="720"/>
+        </w:tabs>
+        <w:ind w:left="720" w:hanging="360"/>
+      </w:pPr>
+      <w:rPr>
+        <w:rFonts w:ascii="Symbol" w:hAnsi="Symbol" w:cs="Symbol"/>
+        <w:sz w:val="20"/>
+      </w:rPr>
+    </w:lvl>
+    <w:lvl w:ilvl="1" w:tentative="0">
+      <w:start w:val="1"/>
+      <w:numFmt w:val="bullet"/>
+      <w:lvlText w:val="o"/>
+      <w:lvlJc w:val="left"/>
+      <w:pPr>
+        <w:tabs>
+          <w:tab w:val="left" w:pos="1440"/>
+        </w:tabs>
+        <w:ind w:left="1440" w:hanging="360"/>
+      </w:pPr>
+      <w:rPr>
+        <w:rFonts w:ascii="Courier New" w:hAnsi="Courier New" w:cs="Courier New"/>
+        <w:sz w:val="20"/>
+      </w:rPr>
+    </w:lvl>
+    <w:lvl w:ilvl="2" w:tentative="0">
+      <w:start w:val="1"/>
+      <w:numFmt w:val="bullet"/>
+      <w:lvlText w:val=""/>
+      <w:lvlJc w:val="left"/>
+      <w:pPr>
+        <w:tabs>
+          <w:tab w:val="left" w:pos="2160"/>
+        </w:tabs>
+        <w:ind w:left="2160" w:hanging="360"/>
+      </w:pPr>
+      <w:rPr>
+        <w:rFonts w:ascii="Wingdings" w:hAnsi="Wingdings" w:cs="Wingdings"/>
+        <w:sz w:val="20"/>
+      </w:rPr>
+    </w:lvl>
+    <w:lvl w:ilvl="3" w:tentative="0">
+      <w:start w:val="1"/>
+      <w:numFmt w:val="bullet"/>
+      <w:lvlText w:val=""/>
+      <w:lvlJc w:val="left"/>
+      <w:pPr>
+        <w:tabs>
+          <w:tab w:val="left" w:pos="2880"/>
+        </w:tabs>
+        <w:ind w:left="2880" w:hanging="360"/>
+      </w:pPr>
+      <w:rPr>
+        <w:rFonts w:hint="default" w:ascii="Wingdings" w:hAnsi="Wingdings" w:cs="Wingdings"/>
+        <w:sz w:val="20"/>
+      </w:rPr>
+    </w:lvl>
+    <w:lvl w:ilvl="4" w:tentative="0">
+      <w:start w:val="1"/>
+      <w:numFmt w:val="bullet"/>
+      <w:lvlText w:val=""/>
+      <w:lvlJc w:val="left"/>
+      <w:pPr>
+        <w:tabs>
+          <w:tab w:val="left" w:pos="3600"/>
+        </w:tabs>
+        <w:ind w:left="3600" w:hanging="360"/>
+      </w:pPr>
+      <w:rPr>
+        <w:rFonts w:hint="default" w:ascii="Wingdings" w:hAnsi="Wingdings" w:cs="Wingdings"/>
+        <w:sz w:val="20"/>
+      </w:rPr>
+    </w:lvl>
+    <w:lvl w:ilvl="5" w:tentative="0">
+      <w:start w:val="1"/>
+      <w:numFmt w:val="bullet"/>
+      <w:lvlText w:val=""/>
+      <w:lvlJc w:val="left"/>
+      <w:pPr>
+        <w:tabs>
+          <w:tab w:val="left" w:pos="4320"/>
+        </w:tabs>
+        <w:ind w:left="4320" w:hanging="360"/>
+      </w:pPr>
+      <w:rPr>
+        <w:rFonts w:hint="default" w:ascii="Wingdings" w:hAnsi="Wingdings" w:cs="Wingdings"/>
+        <w:sz w:val="20"/>
+      </w:rPr>
+    </w:lvl>
+    <w:lvl w:ilvl="6" w:tentative="0">
+      <w:start w:val="1"/>
+      <w:numFmt w:val="bullet"/>
+      <w:lvlText w:val=""/>
+      <w:lvlJc w:val="left"/>
+      <w:pPr>
+        <w:tabs>
+          <w:tab w:val="left" w:pos="5040"/>
+        </w:tabs>
+        <w:ind w:left="5040" w:hanging="360"/>
+      </w:pPr>
+      <w:rPr>
+        <w:rFonts w:hint="default" w:ascii="Wingdings" w:hAnsi="Wingdings" w:cs="Wingdings"/>
+        <w:sz w:val="20"/>
+      </w:rPr>
+    </w:lvl>
+    <w:lvl w:ilvl="7" w:tentative="0">
+      <w:start w:val="1"/>
+      <w:numFmt w:val="bullet"/>
+      <w:lvlText w:val=""/>
+      <w:lvlJc w:val="left"/>
+      <w:pPr>
+        <w:tabs>
+          <w:tab w:val="left" w:pos="5760"/>
+        </w:tabs>
+        <w:ind w:left="5760" w:hanging="360"/>
+      </w:pPr>
+      <w:rPr>
+        <w:rFonts w:hint="default" w:ascii="Wingdings" w:hAnsi="Wingdings" w:cs="Wingdings"/>
+        <w:sz w:val="20"/>
+      </w:rPr>
+    </w:lvl>
+    <w:lvl w:ilvl="8" w:tentative="0">
+      <w:start w:val="1"/>
+      <w:numFmt w:val="bullet"/>
+      <w:lvlText w:val=""/>
+      <w:lvlJc w:val="left"/>
+      <w:pPr>
+        <w:tabs>
+          <w:tab w:val="left" w:pos="6480"/>
+        </w:tabs>
+        <w:ind w:left="6480" w:hanging="360"/>
+      </w:pPr>
+      <w:rPr>
+        <w:rFonts w:hint="default" w:ascii="Wingdings" w:hAnsi="Wingdings" w:cs="Wingdings"/>
+        <w:sz w:val="20"/>
+      </w:rPr>
+    </w:lvl>
+  </w:abstractNum>
+  <w:abstractNum w:abstractNumId="1">
     <w:nsid w:val="DBE29269"/>
     <w:multiLevelType w:val="multilevel"/>
     <w:tmpl w:val="DBE29269"/>
@@ -1941,7 +1486,7 @@
       </w:rPr>
     </w:lvl>
   </w:abstractNum>
-  <w:abstractNum w:abstractNumId="1">
+  <w:abstractNum w:abstractNumId="2">
     <w:nsid w:val="323825F8"/>
     <w:multiLevelType w:val="multilevel"/>
     <w:tmpl w:val="323825F8"/>
@@ -2090,7 +1635,7 @@
       </w:rPr>
     </w:lvl>
   </w:abstractNum>
-  <w:abstractNum w:abstractNumId="2">
+  <w:abstractNum w:abstractNumId="3">
     <w:nsid w:val="34D35B5F"/>
     <w:multiLevelType w:val="multilevel"/>
     <w:tmpl w:val="34D35B5F"/>
@@ -2239,7 +1784,7 @@
       </w:rPr>
     </w:lvl>
   </w:abstractNum>
-  <w:abstractNum w:abstractNumId="3">
+  <w:abstractNum w:abstractNumId="4">
     <w:nsid w:val="469786AD"/>
     <w:multiLevelType w:val="multilevel"/>
     <w:tmpl w:val="469786AD"/>
@@ -2389,16 +1934,19 @@
     </w:lvl>
   </w:abstractNum>
   <w:num w:numId="1">
+    <w:abstractNumId w:val="4"/>
+  </w:num>
+  <w:num w:numId="2">
+    <w:abstractNumId w:val="1"/>
+  </w:num>
+  <w:num w:numId="3">
     <w:abstractNumId w:val="3"/>
   </w:num>
-  <w:num w:numId="2">
-    <w:abstractNumId w:val="0"/>
-  </w:num>
-  <w:num w:numId="3">
+  <w:num w:numId="4">
     <w:abstractNumId w:val="2"/>
   </w:num>
-  <w:num w:numId="4">
-    <w:abstractNumId w:val="1"/>
+  <w:num w:numId="5">
+    <w:abstractNumId w:val="0"/>
   </w:num>
 </w:numbering>
 </file>

</xml_diff>